<commit_message>
Update CV Download Files
</commit_message>
<xml_diff>
--- a/public/cv.docx
+++ b/public/cv.docx
@@ -317,7 +317,21 @@
           <w:color w:val="282828"/>
           <w:sz w:val="19"/>
         </w:rPr>
-        <w:t>I am also the</w:t>
+        <w:t>I am also the founder of XPLORATECH.AI</w:t>
+      </w:r>
+      <w:r>
+        <w:rPr>
+          <w:color w:val="282828"/>
+          <w:sz w:val="19"/>
+        </w:rPr>
+        <w:t xml:space="preserve">, </w:t>
+      </w:r>
+      <w:r>
+        <w:rPr>
+          <w:color w:val="282828"/>
+          <w:sz w:val="19"/>
+        </w:rPr>
+        <w:t>a company I've contracted through since 2003, providing full-stack engineering services and modern AI engineering to agencies and product teams.</w:t>
       </w:r>
       <w:r>
         <w:rPr>
@@ -331,28 +345,14 @@
           <w:color w:val="282828"/>
           <w:sz w:val="19"/>
         </w:rPr>
-        <w:t>founder of</w:t>
-      </w:r>
-      <w:r>
-        <w:rPr>
-          <w:color w:val="282828"/>
-          <w:sz w:val="19"/>
-        </w:rPr>
-        <w:t xml:space="preserve"> an AI Automation Agency</w:t>
-      </w:r>
-      <w:r>
-        <w:rPr>
-          <w:color w:val="282828"/>
-          <w:sz w:val="19"/>
-        </w:rPr>
-        <w:t xml:space="preserve"> called XPLORATECH.AI</w:t>
-      </w:r>
-      <w:r>
-        <w:rPr>
-          <w:color w:val="282828"/>
-          <w:sz w:val="19"/>
-        </w:rPr>
-        <w:t>.</w:t>
+        <w:t>I</w:t>
+      </w:r>
+      <w:r>
+        <w:rPr>
+          <w:color w:val="282828"/>
+          <w:sz w:val="19"/>
+        </w:rPr>
+        <w:t>n this capacity I</w:t>
       </w:r>
       <w:r>
         <w:rPr>
@@ -366,21 +366,28 @@
           <w:color w:val="282828"/>
           <w:sz w:val="19"/>
         </w:rPr>
-        <w:t>I</w:t>
-      </w:r>
-      <w:r>
-        <w:rPr>
-          <w:color w:val="282828"/>
-          <w:sz w:val="19"/>
-        </w:rPr>
-        <w:t>n this capacity I</w:t>
-      </w:r>
-      <w:r>
-        <w:rPr>
-          <w:color w:val="282828"/>
-          <w:sz w:val="19"/>
-        </w:rPr>
-        <w:t xml:space="preserve"> use AI-assisted coding and the latest agentic development tools throughout my </w:t>
+        <w:t xml:space="preserve">have </w:t>
+      </w:r>
+      <w:r>
+        <w:rPr>
+          <w:color w:val="282828"/>
+          <w:sz w:val="19"/>
+        </w:rPr>
+        <w:t>use</w:t>
+      </w:r>
+      <w:r>
+        <w:rPr>
+          <w:color w:val="282828"/>
+          <w:sz w:val="19"/>
+        </w:rPr>
+        <w:t>d</w:t>
+      </w:r>
+      <w:r>
+        <w:rPr>
+          <w:color w:val="282828"/>
+          <w:sz w:val="19"/>
+        </w:rPr>
+        <w:t xml:space="preserve"> AI-assisted coding and the latest agentic development tools throughout my </w:t>
       </w:r>
       <w:r>
         <w:rPr>
@@ -474,23 +481,7 @@
           <w:color w:val="282828"/>
           <w:sz w:val="19"/>
         </w:rPr>
-        <w:t xml:space="preserve">Python, </w:t>
-      </w:r>
-      <w:proofErr w:type="spellStart"/>
-      <w:r>
-        <w:rPr>
-          <w:color w:val="282828"/>
-          <w:sz w:val="19"/>
-        </w:rPr>
-        <w:t>Javascript</w:t>
-      </w:r>
-      <w:proofErr w:type="spellEnd"/>
-      <w:r>
-        <w:rPr>
-          <w:color w:val="282828"/>
-          <w:sz w:val="19"/>
-        </w:rPr>
-        <w:t>, Typescript</w:t>
+        <w:t>Python, Javascript, Typescript</w:t>
       </w:r>
     </w:p>
     <w:p>
@@ -533,23 +524,7 @@
           <w:color w:val="282828"/>
           <w:sz w:val="19"/>
         </w:rPr>
-        <w:t xml:space="preserve"> React, </w:t>
-      </w:r>
-      <w:proofErr w:type="spellStart"/>
-      <w:r>
-        <w:rPr>
-          <w:color w:val="282828"/>
-          <w:sz w:val="19"/>
-        </w:rPr>
-        <w:t>NextJS</w:t>
-      </w:r>
-      <w:proofErr w:type="spellEnd"/>
-      <w:r>
-        <w:rPr>
-          <w:color w:val="282828"/>
-          <w:sz w:val="19"/>
-        </w:rPr>
-        <w:t>, Tailwind CSS, MUI, Django, Flask</w:t>
+        <w:t xml:space="preserve"> React, NextJS, Tailwind CSS, MUI, Django, Flask</w:t>
       </w:r>
       <w:r>
         <w:rPr>
@@ -606,21 +581,12 @@
         </w:rPr>
         <w:t xml:space="preserve">ment, </w:t>
       </w:r>
-      <w:proofErr w:type="spellStart"/>
-      <w:r>
-        <w:rPr>
-          <w:color w:val="282828"/>
-          <w:sz w:val="19"/>
-        </w:rPr>
-        <w:t>spaCy</w:t>
-      </w:r>
-      <w:proofErr w:type="spellEnd"/>
-      <w:r>
-        <w:rPr>
-          <w:color w:val="282828"/>
-          <w:sz w:val="19"/>
-        </w:rPr>
-        <w:t>, NLP</w:t>
+      <w:r>
+        <w:rPr>
+          <w:color w:val="282828"/>
+          <w:sz w:val="19"/>
+        </w:rPr>
+        <w:t>spaCy, NLP</w:t>
       </w:r>
     </w:p>
     <w:p>
@@ -785,17 +751,8 @@
           <w:color w:val="282828"/>
           <w:sz w:val="19"/>
         </w:rPr>
-        <w:t xml:space="preserve">Azure </w:t>
-      </w:r>
-      <w:proofErr w:type="spellStart"/>
-      <w:r>
-        <w:rPr>
-          <w:color w:val="282828"/>
-          <w:sz w:val="19"/>
-        </w:rPr>
-        <w:t>Devops</w:t>
-      </w:r>
-      <w:proofErr w:type="spellEnd"/>
+        <w:t>Azure Devops</w:t>
+      </w:r>
     </w:p>
     <w:p>
       <w:pPr>
@@ -846,12 +803,22 @@
         <w:rPr>
           <w:b/>
         </w:rPr>
-        <w:t>Founder &amp; CTO</w:t>
+        <w:t>Founder</w:t>
+      </w:r>
+      <w:r>
+        <w:rPr>
+          <w:b/>
+        </w:rPr>
+        <w:t xml:space="preserve"> &amp; Full Stack AI Engineer</w:t>
       </w:r>
     </w:p>
     <w:p>
       <w:pPr>
         <w:spacing w:after="40"/>
+        <w:rPr>
+          <w:color w:val="505050"/>
+          <w:sz w:val="19"/>
+        </w:rPr>
       </w:pPr>
       <w:r>
         <w:rPr>
@@ -879,7 +846,28 @@
           <w:color w:val="282828"/>
           <w:sz w:val="19"/>
         </w:rPr>
-        <w:t>Conduct in-depth audits of client workflows to identify inefficiencies and areas of waste, delivering clear, actionable reports outlining targeted AI tool recommendations to streamline operations and reduce costs.</w:t>
+        <w:t>P</w:t>
+      </w:r>
+      <w:r>
+        <w:rPr>
+          <w:color w:val="282828"/>
+          <w:sz w:val="19"/>
+        </w:rPr>
+        <w:t>rovid</w:t>
+      </w:r>
+      <w:r>
+        <w:rPr>
+          <w:color w:val="282828"/>
+          <w:sz w:val="19"/>
+        </w:rPr>
+        <w:t>ed</w:t>
+      </w:r>
+      <w:r>
+        <w:rPr>
+          <w:color w:val="282828"/>
+          <w:sz w:val="19"/>
+        </w:rPr>
+        <w:t xml:space="preserve"> full-stack engineering services to agencies and product teams.</w:t>
       </w:r>
     </w:p>
     <w:p>
@@ -900,7 +888,28 @@
           <w:color w:val="282828"/>
           <w:sz w:val="19"/>
         </w:rPr>
-        <w:t>Design and build production-grade agentic AI applications that implement audit findings end-to-end, automating complex business processes with reliable, scalable solutions.</w:t>
+        <w:t>D</w:t>
+      </w:r>
+      <w:r>
+        <w:rPr>
+          <w:color w:val="282828"/>
+          <w:sz w:val="19"/>
+        </w:rPr>
+        <w:t>eliver</w:t>
+      </w:r>
+      <w:r>
+        <w:rPr>
+          <w:color w:val="282828"/>
+          <w:sz w:val="19"/>
+        </w:rPr>
+        <w:t>ed</w:t>
+      </w:r>
+      <w:r>
+        <w:rPr>
+          <w:color w:val="282828"/>
+          <w:sz w:val="19"/>
+        </w:rPr>
+        <w:t xml:space="preserve"> production systems end to end across frontend, backend, and infrastructure in the debt management sector.</w:t>
       </w:r>
     </w:p>
     <w:p>
@@ -921,7 +930,14 @@
           <w:color w:val="282828"/>
           <w:sz w:val="19"/>
         </w:rPr>
-        <w:t>Collaborate directly with businesses to scope, architect, and deliver AI projects they already have in mind, acting as a trusted technical partner from concept through to deployment.</w:t>
+        <w:t>Shipped</w:t>
+      </w:r>
+      <w:r>
+        <w:rPr>
+          <w:color w:val="282828"/>
+          <w:sz w:val="19"/>
+        </w:rPr>
+        <w:t xml:space="preserve"> a client project that required a search platform built on vector embeddings, LLM enrichment, embedded search, and agentic RAG.</w:t>
       </w:r>
     </w:p>
     <w:p>
@@ -942,23 +958,42 @@
           <w:color w:val="282828"/>
           <w:sz w:val="19"/>
         </w:rPr>
-        <w:t xml:space="preserve">Leverage cutting-edge AI-assisted development tooling to produce high-quality, production-ready code faster and more cost-effectively than traditional development approaches, </w:t>
-      </w:r>
-      <w:proofErr w:type="spellStart"/>
-      <w:r>
-        <w:rPr>
-          <w:color w:val="282828"/>
-          <w:sz w:val="19"/>
-        </w:rPr>
-        <w:t>maximising</w:t>
-      </w:r>
-      <w:proofErr w:type="spellEnd"/>
-      <w:r>
-        <w:rPr>
-          <w:color w:val="282828"/>
-          <w:sz w:val="19"/>
-        </w:rPr>
-        <w:t xml:space="preserve"> client ROI.</w:t>
+        <w:t xml:space="preserve">Focus </w:t>
+      </w:r>
+      <w:r>
+        <w:rPr>
+          <w:color w:val="282828"/>
+          <w:sz w:val="19"/>
+        </w:rPr>
+        <w:t>on modern AI engineering</w:t>
+      </w:r>
+      <w:r>
+        <w:rPr>
+          <w:color w:val="282828"/>
+          <w:sz w:val="19"/>
+        </w:rPr>
+        <w:t xml:space="preserve">, </w:t>
+      </w:r>
+      <w:r>
+        <w:rPr>
+          <w:color w:val="282828"/>
+          <w:sz w:val="19"/>
+        </w:rPr>
+        <w:t xml:space="preserve">building with agentic architectures, RAG pipelines, and frontier LLMs, and integrating AI-assisted development </w:t>
+      </w:r>
+      <w:r>
+        <w:rPr>
+          <w:color w:val="282828"/>
+          <w:sz w:val="19"/>
+        </w:rPr>
+        <w:t>to design, build and test</w:t>
+      </w:r>
+      <w:r>
+        <w:rPr>
+          <w:color w:val="282828"/>
+          <w:sz w:val="19"/>
+        </w:rPr>
+        <w:t xml:space="preserve"> production-ready software faster.</w:t>
       </w:r>
     </w:p>
     <w:p>
@@ -979,7 +1014,6 @@
           <w:lang w:val="en-GB"/>
         </w:rPr>
       </w:pPr>
-      <w:proofErr w:type="spellStart"/>
       <w:r>
         <w:rPr>
           <w:color w:val="505050"/>
@@ -988,7 +1022,6 @@
         </w:rPr>
         <w:t>Intrum</w:t>
       </w:r>
-      <w:proofErr w:type="spellEnd"/>
       <w:r>
         <w:rPr>
           <w:color w:val="505050"/>
@@ -1104,21 +1137,12 @@
       <w:pPr>
         <w:spacing w:after="40"/>
       </w:pPr>
-      <w:proofErr w:type="spellStart"/>
       <w:r>
         <w:rPr>
           <w:color w:val="505050"/>
           <w:sz w:val="19"/>
         </w:rPr>
-        <w:t>CiiVSOFT</w:t>
-      </w:r>
-      <w:proofErr w:type="spellEnd"/>
-      <w:r>
-        <w:rPr>
-          <w:color w:val="505050"/>
-          <w:sz w:val="19"/>
-        </w:rPr>
-        <w:t xml:space="preserve">  |  Jan 2019 - Jul 2023  |  Remote, </w:t>
+        <w:t xml:space="preserve">CiiVSOFT  |  Jan 2019 - Jul 2023  |  Remote, </w:t>
       </w:r>
       <w:r>
         <w:rPr>
@@ -1325,21 +1349,12 @@
         <w:spacing w:before="20" w:after="20"/>
         <w:ind w:left="288" w:hanging="360"/>
       </w:pPr>
-      <w:proofErr w:type="spellStart"/>
-      <w:r>
-        <w:rPr>
-          <w:color w:val="282828"/>
-          <w:sz w:val="19"/>
-        </w:rPr>
-        <w:t>Optimised</w:t>
-      </w:r>
-      <w:proofErr w:type="spellEnd"/>
-      <w:r>
-        <w:rPr>
-          <w:color w:val="282828"/>
-          <w:sz w:val="19"/>
-        </w:rPr>
-        <w:t xml:space="preserve"> platform-level data processing infrastructure, achieving significant gains in throughput and stability.</w:t>
+      <w:r>
+        <w:rPr>
+          <w:color w:val="282828"/>
+          <w:sz w:val="19"/>
+        </w:rPr>
+        <w:t>Optimised platform-level data processing infrastructure, achieving significant gains in throughput and stability.</w:t>
       </w:r>
     </w:p>
     <w:p>
@@ -1813,8 +1828,124 @@
       </w:rPr>
     </w:lvl>
   </w:abstractNum>
+  <w:abstractNum w:abstractNumId="1" w15:restartNumberingAfterBreak="0">
+    <w:nsid w:val="04403CA7"/>
+    <w:multiLevelType w:val="hybridMultilevel"/>
+    <w:tmpl w:val="11EC0358"/>
+    <w:lvl w:ilvl="0" w:tplc="08090001">
+      <w:start w:val="1"/>
+      <w:numFmt w:val="bullet"/>
+      <w:lvlText w:val=""/>
+      <w:lvlJc w:val="left"/>
+      <w:pPr>
+        <w:ind w:left="720" w:hanging="360"/>
+      </w:pPr>
+      <w:rPr>
+        <w:rFonts w:ascii="Symbol" w:hAnsi="Symbol" w:hint="default"/>
+      </w:rPr>
+    </w:lvl>
+    <w:lvl w:ilvl="1" w:tplc="08090003" w:tentative="1">
+      <w:start w:val="1"/>
+      <w:numFmt w:val="bullet"/>
+      <w:lvlText w:val="o"/>
+      <w:lvlJc w:val="left"/>
+      <w:pPr>
+        <w:ind w:left="1440" w:hanging="360"/>
+      </w:pPr>
+      <w:rPr>
+        <w:rFonts w:ascii="Courier New" w:hAnsi="Courier New" w:cs="Courier New" w:hint="default"/>
+      </w:rPr>
+    </w:lvl>
+    <w:lvl w:ilvl="2" w:tplc="08090005" w:tentative="1">
+      <w:start w:val="1"/>
+      <w:numFmt w:val="bullet"/>
+      <w:lvlText w:val=""/>
+      <w:lvlJc w:val="left"/>
+      <w:pPr>
+        <w:ind w:left="2160" w:hanging="360"/>
+      </w:pPr>
+      <w:rPr>
+        <w:rFonts w:ascii="Wingdings" w:hAnsi="Wingdings" w:hint="default"/>
+      </w:rPr>
+    </w:lvl>
+    <w:lvl w:ilvl="3" w:tplc="08090001" w:tentative="1">
+      <w:start w:val="1"/>
+      <w:numFmt w:val="bullet"/>
+      <w:lvlText w:val=""/>
+      <w:lvlJc w:val="left"/>
+      <w:pPr>
+        <w:ind w:left="2880" w:hanging="360"/>
+      </w:pPr>
+      <w:rPr>
+        <w:rFonts w:ascii="Symbol" w:hAnsi="Symbol" w:hint="default"/>
+      </w:rPr>
+    </w:lvl>
+    <w:lvl w:ilvl="4" w:tplc="08090003" w:tentative="1">
+      <w:start w:val="1"/>
+      <w:numFmt w:val="bullet"/>
+      <w:lvlText w:val="o"/>
+      <w:lvlJc w:val="left"/>
+      <w:pPr>
+        <w:ind w:left="3600" w:hanging="360"/>
+      </w:pPr>
+      <w:rPr>
+        <w:rFonts w:ascii="Courier New" w:hAnsi="Courier New" w:cs="Courier New" w:hint="default"/>
+      </w:rPr>
+    </w:lvl>
+    <w:lvl w:ilvl="5" w:tplc="08090005" w:tentative="1">
+      <w:start w:val="1"/>
+      <w:numFmt w:val="bullet"/>
+      <w:lvlText w:val=""/>
+      <w:lvlJc w:val="left"/>
+      <w:pPr>
+        <w:ind w:left="4320" w:hanging="360"/>
+      </w:pPr>
+      <w:rPr>
+        <w:rFonts w:ascii="Wingdings" w:hAnsi="Wingdings" w:hint="default"/>
+      </w:rPr>
+    </w:lvl>
+    <w:lvl w:ilvl="6" w:tplc="08090001" w:tentative="1">
+      <w:start w:val="1"/>
+      <w:numFmt w:val="bullet"/>
+      <w:lvlText w:val=""/>
+      <w:lvlJc w:val="left"/>
+      <w:pPr>
+        <w:ind w:left="5040" w:hanging="360"/>
+      </w:pPr>
+      <w:rPr>
+        <w:rFonts w:ascii="Symbol" w:hAnsi="Symbol" w:hint="default"/>
+      </w:rPr>
+    </w:lvl>
+    <w:lvl w:ilvl="7" w:tplc="08090003" w:tentative="1">
+      <w:start w:val="1"/>
+      <w:numFmt w:val="bullet"/>
+      <w:lvlText w:val="o"/>
+      <w:lvlJc w:val="left"/>
+      <w:pPr>
+        <w:ind w:left="5760" w:hanging="360"/>
+      </w:pPr>
+      <w:rPr>
+        <w:rFonts w:ascii="Courier New" w:hAnsi="Courier New" w:cs="Courier New" w:hint="default"/>
+      </w:rPr>
+    </w:lvl>
+    <w:lvl w:ilvl="8" w:tplc="08090005" w:tentative="1">
+      <w:start w:val="1"/>
+      <w:numFmt w:val="bullet"/>
+      <w:lvlText w:val=""/>
+      <w:lvlJc w:val="left"/>
+      <w:pPr>
+        <w:ind w:left="6480" w:hanging="360"/>
+      </w:pPr>
+      <w:rPr>
+        <w:rFonts w:ascii="Wingdings" w:hAnsi="Wingdings" w:hint="default"/>
+      </w:rPr>
+    </w:lvl>
+  </w:abstractNum>
   <w:num w:numId="1" w16cid:durableId="1002972283">
     <w:abstractNumId w:val="0"/>
+  </w:num>
+  <w:num w:numId="2" w16cid:durableId="911157837">
+    <w:abstractNumId w:val="1"/>
   </w:num>
 </w:numbering>
 </file>

</xml_diff>

<commit_message>
Update CV Files & Refresh About Opening
Co-Authored-By: Claude Opus 5 (1M context) <noreply@anthropic.com>
</commit_message>
<xml_diff>
--- a/public/cv.docx
+++ b/public/cv.docx
@@ -88,21 +88,7 @@
             <w:rStyle w:val="Hyperlink"/>
             <w:rFonts w:ascii="Calibri" w:hAnsi="Calibri" w:cs="Calibri"/>
           </w:rPr>
-          <w:t>Portfo</w:t>
-        </w:r>
-        <w:r>
-          <w:rPr>
-            <w:rStyle w:val="Hyperlink"/>
-            <w:rFonts w:ascii="Calibri" w:hAnsi="Calibri" w:cs="Calibri"/>
-          </w:rPr>
-          <w:t>l</w:t>
-        </w:r>
-        <w:r>
-          <w:rPr>
-            <w:rStyle w:val="Hyperlink"/>
-            <w:rFonts w:ascii="Calibri" w:hAnsi="Calibri" w:cs="Calibri"/>
-          </w:rPr>
-          <w:t>io</w:t>
+          <w:t>Portfolio</w:t>
         </w:r>
       </w:hyperlink>
       <w:r>
@@ -117,54 +103,24 @@
             <w:rStyle w:val="Hyperlink"/>
             <w:rFonts w:ascii="Calibri" w:hAnsi="Calibri" w:cs="Calibri"/>
           </w:rPr>
-          <w:t>Link</w:t>
+          <w:t>LinkedIn</w:t>
         </w:r>
+      </w:hyperlink>
+      <w:r>
+        <w:rPr>
+          <w:rFonts w:ascii="Calibri" w:hAnsi="Calibri" w:cs="Calibri"/>
+        </w:rPr>
+        <w:t xml:space="preserve"> | </w:t>
+      </w:r>
+      <w:hyperlink r:id="rId8" w:history="1">
         <w:r>
           <w:rPr>
             <w:rStyle w:val="Hyperlink"/>
             <w:rFonts w:ascii="Calibri" w:hAnsi="Calibri" w:cs="Calibri"/>
           </w:rPr>
-          <w:t>e</w:t>
-        </w:r>
-        <w:r>
-          <w:rPr>
-            <w:rStyle w:val="Hyperlink"/>
-            <w:rFonts w:ascii="Calibri" w:hAnsi="Calibri" w:cs="Calibri"/>
-          </w:rPr>
-          <w:t>dIn</w:t>
+          <w:t>Github</w:t>
         </w:r>
       </w:hyperlink>
-      <w:r>
-        <w:rPr>
-          <w:rFonts w:ascii="Calibri" w:hAnsi="Calibri" w:cs="Calibri"/>
-        </w:rPr>
-        <w:t xml:space="preserve"> | </w:t>
-      </w:r>
-      <w:hyperlink r:id="rId8" w:history="1">
-        <w:proofErr w:type="spellStart"/>
-        <w:r>
-          <w:rPr>
-            <w:rStyle w:val="Hyperlink"/>
-            <w:rFonts w:ascii="Calibri" w:hAnsi="Calibri" w:cs="Calibri"/>
-          </w:rPr>
-          <w:t>Gith</w:t>
-        </w:r>
-        <w:r>
-          <w:rPr>
-            <w:rStyle w:val="Hyperlink"/>
-            <w:rFonts w:ascii="Calibri" w:hAnsi="Calibri" w:cs="Calibri"/>
-          </w:rPr>
-          <w:t>u</w:t>
-        </w:r>
-        <w:r>
-          <w:rPr>
-            <w:rStyle w:val="Hyperlink"/>
-            <w:rFonts w:ascii="Calibri" w:hAnsi="Calibri" w:cs="Calibri"/>
-          </w:rPr>
-          <w:t>b</w:t>
-        </w:r>
-        <w:proofErr w:type="spellEnd"/>
-      </w:hyperlink>
     </w:p>
     <w:p>
       <w:pPr>
@@ -200,7 +156,25 @@
         <w:rPr>
           <w:rFonts w:ascii="Calibri" w:hAnsi="Calibri" w:cs="Calibri"/>
         </w:rPr>
-        <w:t xml:space="preserve">Full stack engineer with 30 years in technology, across many industries and company sizes, as both </w:t>
+        <w:t>Experienced f</w:t>
+      </w:r>
+      <w:r>
+        <w:rPr>
+          <w:rFonts w:ascii="Calibri" w:hAnsi="Calibri" w:cs="Calibri"/>
+        </w:rPr>
+        <w:t xml:space="preserve">ull stack engineer, </w:t>
+      </w:r>
+      <w:r>
+        <w:rPr>
+          <w:rFonts w:ascii="Calibri" w:hAnsi="Calibri" w:cs="Calibri"/>
+        </w:rPr>
+        <w:t xml:space="preserve">working </w:t>
+      </w:r>
+      <w:r>
+        <w:rPr>
+          <w:rFonts w:ascii="Calibri" w:hAnsi="Calibri" w:cs="Calibri"/>
+        </w:rPr>
+        <w:t xml:space="preserve">across many industries and company sizes, as both </w:t>
       </w:r>
       <w:r>
         <w:rPr>
@@ -380,16 +354,8 @@
         <w:rPr>
           <w:rFonts w:ascii="Calibri" w:hAnsi="Calibri" w:cs="Calibri"/>
         </w:rPr>
-        <w:t xml:space="preserve"> React, Next.js, Django, Flask, Tailwind CSS, MUI, </w:t>
-      </w:r>
-      <w:proofErr w:type="spellStart"/>
-      <w:r>
-        <w:rPr>
-          <w:rFonts w:ascii="Calibri" w:hAnsi="Calibri" w:cs="Calibri"/>
-        </w:rPr>
-        <w:t>Pydantic</w:t>
-      </w:r>
-      <w:proofErr w:type="spellEnd"/>
+        <w:t xml:space="preserve"> React, Next.js, Django, Flask, Tailwind CSS, MUI, Pydantic</w:t>
+      </w:r>
     </w:p>
     <w:p>
       <w:pPr>
@@ -500,21 +466,7 @@
         <w:rPr>
           <w:rFonts w:ascii="Calibri" w:hAnsi="Calibri" w:cs="Calibri"/>
         </w:rPr>
-        <w:t xml:space="preserve">, </w:t>
-      </w:r>
-      <w:proofErr w:type="spellStart"/>
-      <w:r>
-        <w:rPr>
-          <w:rFonts w:ascii="Calibri" w:hAnsi="Calibri" w:cs="Calibri"/>
-        </w:rPr>
-        <w:t>OpenAPI</w:t>
-      </w:r>
-      <w:proofErr w:type="spellEnd"/>
-      <w:r>
-        <w:rPr>
-          <w:rFonts w:ascii="Calibri" w:hAnsi="Calibri" w:cs="Calibri"/>
-        </w:rPr>
-        <w:t>, JWT</w:t>
+        <w:t>, OpenAPI, JWT</w:t>
       </w:r>
     </w:p>
     <w:p>
@@ -1038,21 +990,7 @@
         <w:rPr>
           <w:rFonts w:ascii="Calibri" w:hAnsi="Calibri" w:cs="Calibri"/>
         </w:rPr>
-        <w:t xml:space="preserve">Built an in-house NLP resume parser using Flask and </w:t>
-      </w:r>
-      <w:proofErr w:type="spellStart"/>
-      <w:r>
-        <w:rPr>
-          <w:rFonts w:ascii="Calibri" w:hAnsi="Calibri" w:cs="Calibri"/>
-        </w:rPr>
-        <w:t>spaCy</w:t>
-      </w:r>
-      <w:proofErr w:type="spellEnd"/>
-      <w:r>
-        <w:rPr>
-          <w:rFonts w:ascii="Calibri" w:hAnsi="Calibri" w:cs="Calibri"/>
-        </w:rPr>
-        <w:t>, removing a costly and unreliable third-party dependency, processing thousands of job applications per hour for the first enterprise client.</w:t>
+        <w:t>Built an in-house NLP resume parser using Flask and spaCy, removing a costly and unreliable third-party dependency, processing thousands of job applications per hour for the first enterprise client.</w:t>
       </w:r>
     </w:p>
     <w:p>
@@ -1070,27 +1008,13 @@
         <w:rPr>
           <w:rFonts w:ascii="Calibri" w:hAnsi="Calibri" w:cs="Calibri"/>
         </w:rPr>
-        <w:t xml:space="preserve">Delivered £1.3 million in hiring cost savings for a transport operator, and led onboarding for major European clients including Alstom, Agoda, Babcock, EDP and </w:t>
-      </w:r>
-      <w:proofErr w:type="spellStart"/>
-      <w:r>
-        <w:rPr>
-          <w:rFonts w:ascii="Calibri" w:hAnsi="Calibri" w:cs="Calibri"/>
-        </w:rPr>
-        <w:t>Glov</w:t>
-      </w:r>
-      <w:r>
-        <w:rPr>
-          <w:rFonts w:ascii="Calibri" w:hAnsi="Calibri" w:cs="Calibri"/>
-        </w:rPr>
-        <w:t>o</w:t>
-      </w:r>
-      <w:proofErr w:type="spellEnd"/>
-      <w:r>
-        <w:rPr>
-          <w:rFonts w:ascii="Calibri" w:hAnsi="Calibri" w:cs="Calibri"/>
-        </w:rPr>
-        <w:t>.</w:t>
+        <w:t>Delivered £1.3 million in hiring cost savings for a transport operator, and led onboarding for major European clients including Alstom, Agoda, Babcock, EDP and Glov</w:t>
+      </w:r>
+      <w:r>
+        <w:rPr>
+          <w:rFonts w:ascii="Calibri" w:hAnsi="Calibri" w:cs="Calibri"/>
+        </w:rPr>
+        <w:t>o.</w:t>
       </w:r>
     </w:p>
     <w:p>
@@ -1108,21 +1032,7 @@
         <w:rPr>
           <w:rFonts w:ascii="Calibri" w:hAnsi="Calibri" w:cs="Calibri"/>
         </w:rPr>
-        <w:t xml:space="preserve">Replaced key infrastructure with serverless microservices on </w:t>
-      </w:r>
-      <w:proofErr w:type="spellStart"/>
-      <w:r>
-        <w:rPr>
-          <w:rFonts w:ascii="Calibri" w:hAnsi="Calibri" w:cs="Calibri"/>
-        </w:rPr>
-        <w:t>EventBridge</w:t>
-      </w:r>
-      <w:proofErr w:type="spellEnd"/>
-      <w:r>
-        <w:rPr>
-          <w:rFonts w:ascii="Calibri" w:hAnsi="Calibri" w:cs="Calibri"/>
-        </w:rPr>
-        <w:t>, Step Functions, Lambda and DynamoDB, and built the engineering team, running code reviews, mentoring and Agile delivery.</w:t>
+        <w:t>Replaced key infrastructure with serverless microservices on EventBridge, Step Functions, Lambda and DynamoDB, and built the engineering team, running code reviews, mentoring and Agile delivery.</w:t>
       </w:r>
     </w:p>
     <w:p>
@@ -1188,21 +1098,7 @@
         <w:rPr>
           <w:rFonts w:ascii="Calibri" w:hAnsi="Calibri" w:cs="Calibri"/>
         </w:rPr>
-        <w:t xml:space="preserve">Built bespoke feed processors for Amazon, eBay and </w:t>
-      </w:r>
-      <w:proofErr w:type="spellStart"/>
-      <w:r>
-        <w:rPr>
-          <w:rFonts w:ascii="Calibri" w:hAnsi="Calibri" w:cs="Calibri"/>
-        </w:rPr>
-        <w:t>Billiger</w:t>
-      </w:r>
-      <w:proofErr w:type="spellEnd"/>
-      <w:r>
-        <w:rPr>
-          <w:rFonts w:ascii="Calibri" w:hAnsi="Calibri" w:cs="Calibri"/>
-        </w:rPr>
-        <w:t>, and rebuilt the downloader to handle frequent downloads from around 1,000 clients.</w:t>
+        <w:t>Built bespoke feed processors for Amazon, eBay and Billiger, and rebuilt the downloader to handle frequent downloads from around 1,000 clients.</w:t>
       </w:r>
     </w:p>
     <w:p>

</xml_diff>